<commit_message>
feat: Implement PSIR report management including API endpoints, dashboard UI, and DOCX export functionality.
</commit_message>
<xml_diff>
--- a/templates/TEV.docx
+++ b/templates/TEV.docx
@@ -343,7 +343,6 @@
               </w:rPr>
               <w:t>{</w:t>
             </w:r>
-            <w:proofErr w:type="spellStart"/>
             <w:r>
               <w:rPr>
                 <w:rFonts w:ascii="Times New Roman" w:hAnsi="Times New Roman"/>
@@ -356,15 +355,7 @@
                 <w:rFonts w:ascii="Times New Roman" w:hAnsi="Times New Roman"/>
                 <w:sz w:val="20"/>
               </w:rPr>
-              <w:t>_No</w:t>
-            </w:r>
-            <w:proofErr w:type="spellEnd"/>
-            <w:r>
-              <w:rPr>
-                <w:rFonts w:ascii="Times New Roman" w:hAnsi="Times New Roman"/>
-                <w:sz w:val="20"/>
-              </w:rPr>
-              <w:t>}</w:t>
+              <w:t>_No}</w:t>
             </w:r>
           </w:p>
         </w:tc>
@@ -393,7 +384,6 @@
               </w:rPr>
               <w:t>{</w:t>
             </w:r>
-            <w:proofErr w:type="spellStart"/>
             <w:r>
               <w:rPr>
                 <w:rFonts w:ascii="Times New Roman" w:hAnsi="Times New Roman"/>
@@ -406,14 +396,7 @@
               <w:rPr>
                 <w:rFonts w:ascii="Times New Roman" w:hAnsi="Times New Roman"/>
               </w:rPr>
-              <w:t>_Name</w:t>
-            </w:r>
-            <w:proofErr w:type="spellEnd"/>
-            <w:r>
-              <w:rPr>
-                <w:rFonts w:ascii="Times New Roman" w:hAnsi="Times New Roman"/>
-              </w:rPr>
-              <w:t>}</w:t>
+              <w:t>_Name}</w:t>
             </w:r>
           </w:p>
         </w:tc>
@@ -485,21 +468,7 @@
               <w:rPr>
                 <w:rFonts w:ascii="Times New Roman" w:hAnsi="Times New Roman"/>
               </w:rPr>
-              <w:t>{</w:t>
-            </w:r>
-            <w:proofErr w:type="spellStart"/>
-            <w:r>
-              <w:rPr>
-                <w:rFonts w:ascii="Times New Roman" w:hAnsi="Times New Roman"/>
-              </w:rPr>
-              <w:t>Date_Ordered</w:t>
-            </w:r>
-            <w:proofErr w:type="spellEnd"/>
-            <w:r>
-              <w:rPr>
-                <w:rFonts w:ascii="Times New Roman" w:hAnsi="Times New Roman"/>
-              </w:rPr>
-              <w:t>}</w:t>
+              <w:t>{Date_Ordered}</w:t>
             </w:r>
           </w:p>
         </w:tc>
@@ -536,59 +505,14 @@
               <w:rPr>
                 <w:rFonts w:ascii="Times New Roman" w:hAnsi="Times New Roman"/>
               </w:rPr>
-              <w:t>{</w:t>
-            </w:r>
-            <w:proofErr w:type="spellStart"/>
-            <w:r>
-              <w:rPr>
-                <w:rFonts w:ascii="Times New Roman" w:hAnsi="Times New Roman"/>
-              </w:rPr>
-              <w:t>Date_</w:t>
-            </w:r>
-            <w:proofErr w:type="gramStart"/>
-            <w:r>
-              <w:rPr>
-                <w:rFonts w:ascii="Times New Roman" w:hAnsi="Times New Roman"/>
-              </w:rPr>
-              <w:t>Received</w:t>
-            </w:r>
-            <w:proofErr w:type="spellEnd"/>
-            <w:r>
-              <w:rPr>
-                <w:rFonts w:ascii="Times New Roman" w:hAnsi="Times New Roman"/>
-              </w:rPr>
-              <w:t>}</w:t>
+              <w:t>{Date_Received}</w:t>
             </w:r>
             <w:r>
               <w:rPr>
                 <w:rFonts w:ascii="Times New Roman" w:hAnsi="Times New Roman"/>
                 <w:lang w:val="fr-FR"/>
               </w:rPr>
-              <w:t>{</w:t>
-            </w:r>
-            <w:proofErr w:type="gramEnd"/>
-            <w:r>
-              <w:rPr>
-                <w:rFonts w:ascii="Times New Roman" w:hAnsi="Times New Roman"/>
-                <w:lang w:val="fr-FR"/>
-              </w:rPr>
-              <w:t>/</w:t>
-            </w:r>
-            <w:proofErr w:type="spellStart"/>
-            <w:r>
-              <w:rPr>
-                <w:rFonts w:ascii="Times New Roman" w:hAnsi="Times New Roman"/>
-                <w:lang w:val="fr-FR"/>
-              </w:rPr>
-              <w:t>rows</w:t>
-            </w:r>
-            <w:proofErr w:type="spellEnd"/>
-            <w:r>
-              <w:rPr>
-                <w:rFonts w:ascii="Times New Roman" w:hAnsi="Times New Roman"/>
-                <w:lang w:val="fr-FR"/>
-              </w:rPr>
-              <w:t>}</w:t>
+              <w:t>{/rows}</w:t>
             </w:r>
           </w:p>
           <w:p>
@@ -641,6 +565,18 @@
                 <w:rFonts w:ascii="Times New Roman" w:hAnsi="Times New Roman"/>
               </w:rPr>
             </w:pPr>
+            <w:r>
+              <w:rPr>
+                <w:rFonts w:ascii="Times New Roman" w:hAnsi="Times New Roman"/>
+              </w:rPr>
+              <w:t>{Date_Submitted}</w:t>
+            </w:r>
+            <w:r>
+              <w:rPr>
+                <w:rFonts w:ascii="Times New Roman" w:hAnsi="Times New Roman"/>
+              </w:rPr>
+              <w:t>}{/rows}</w:t>
+            </w:r>
           </w:p>
         </w:tc>
       </w:tr>

</xml_diff>

<commit_message>
feat: add TEV file
</commit_message>
<xml_diff>
--- a/templates/TEV.docx
+++ b/templates/TEV.docx
@@ -505,14 +505,13 @@
               <w:rPr>
                 <w:rFonts w:ascii="Times New Roman" w:hAnsi="Times New Roman"/>
               </w:rPr>
-              <w:t>{Date_Received}</w:t>
-            </w:r>
-            <w:r>
-              <w:rPr>
-                <w:rFonts w:ascii="Times New Roman" w:hAnsi="Times New Roman"/>
-                <w:lang w:val="fr-FR"/>
-              </w:rPr>
-              <w:t>{/rows}</w:t>
+              <w:t>{Date_Received</w:t>
+            </w:r>
+            <w:r>
+              <w:rPr>
+                <w:rFonts w:ascii="Times New Roman" w:hAnsi="Times New Roman"/>
+              </w:rPr>
+              <w:t>}</w:t>
             </w:r>
           </w:p>
           <w:p>
@@ -542,7 +541,7 @@
               <w:rPr>
                 <w:rFonts w:ascii="Times New Roman" w:hAnsi="Times New Roman"/>
               </w:rPr>
-              <w:t>PSIR</w:t>
+              <w:t>{Report_Type}</w:t>
             </w:r>
           </w:p>
         </w:tc>
@@ -563,17 +562,26 @@
               <w:jc w:val="center"/>
               <w:rPr>
                 <w:rFonts w:ascii="Times New Roman" w:hAnsi="Times New Roman"/>
+                <w:lang w:val="fr-FR"/>
               </w:rPr>
             </w:pPr>
             <w:r>
               <w:rPr>
                 <w:rFonts w:ascii="Times New Roman" w:hAnsi="Times New Roman"/>
               </w:rPr>
-              <w:t>{Date_Submitted}</w:t>
-            </w:r>
-            <w:r>
-              <w:rPr>
-                <w:rFonts w:ascii="Times New Roman" w:hAnsi="Times New Roman"/>
+              <w:t>{</w:t>
+            </w:r>
+            <w:r>
+              <w:rPr>
+                <w:rFonts w:ascii="Times New Roman" w:hAnsi="Times New Roman"/>
+                <w:lang w:val="fr-FR"/>
+              </w:rPr>
+              <w:t>Date_Submitted</w:t>
+            </w:r>
+            <w:r>
+              <w:rPr>
+                <w:rFonts w:ascii="Times New Roman" w:hAnsi="Times New Roman"/>
+                <w:lang w:val="fr-FR"/>
               </w:rPr>
               <w:t>}{/rows}</w:t>
             </w:r>

</xml_diff>